<commit_message>
Update resume PDF and update about me info.
</commit_message>
<xml_diff>
--- a/assets/Zane Behen Resume.docx
+++ b/assets/Zane Behen Resume.docx
@@ -71,17 +71,6 @@
     <w:p>
       <w:pPr>
         <w:pStyle w:val="Normal"/>
-        <w:spacing w:lineRule="auto" w:line="259" w:before="0" w:after="0"/>
-        <w:ind w:hanging="0" w:left="0"/>
-        <w:rPr/>
-      </w:pPr>
-      <w:r>
-        <w:rPr/>
-      </w:r>
-    </w:p>
-    <w:p>
-      <w:pPr>
-        <w:pStyle w:val="Normal"/>
         <w:spacing w:lineRule="auto" w:line="259" w:before="0" w:after="55"/>
         <w:ind w:hanging="0" w:left="74"/>
         <w:jc w:val="center"/>
@@ -99,8 +88,15 @@
         <w:rPr/>
       </w:pPr>
       <w:r>
-        <w:rPr/>
-        <w:t xml:space="preserve">Professional Summary </w:t>
+        <w:rPr>
+          <w:sz w:val="30"/>
+          <w:szCs w:val="30"/>
+        </w:rPr>
+        <w:t>Professional Summary</w:t>
+      </w:r>
+      <w:r>
+        <w:rPr/>
+        <w:t xml:space="preserve"> </w:t>
       </w:r>
     </w:p>
     <w:p>
@@ -141,9 +137,14 @@
                           </a:xfrm>
                           <a:custGeom>
                             <a:avLst/>
-                            <a:gdLst/>
+                            <a:gdLst>
+                              <a:gd name="textAreaLeft" fmla="*/ 0 w 3274560"/>
+                              <a:gd name="textAreaRight" fmla="*/ 3274920 w 3274560"/>
+                              <a:gd name="textAreaTop" fmla="*/ 0 h 10800"/>
+                              <a:gd name="textAreaBottom" fmla="*/ 11160 h 10800"/>
+                            </a:gdLst>
                             <a:ahLst/>
-                            <a:rect l="l" t="t" r="r" b="b"/>
+                            <a:rect l="textAreaLeft" t="textAreaTop" r="textAreaRight" b="textAreaBottom"/>
                             <a:pathLst>
                               <a:path w="5775960" h="19050">
                                 <a:moveTo>
@@ -196,53 +197,19 @@
     <w:p>
       <w:pPr>
         <w:pStyle w:val="Normal"/>
-        <w:spacing w:lineRule="auto" w:line="259" w:before="0" w:after="103"/>
-        <w:ind w:hanging="0" w:left="16"/>
-        <w:rPr/>
-      </w:pPr>
-      <w:r>
-        <w:rPr>
-          <w:sz w:val="11"/>
-        </w:rPr>
-        <w:t xml:space="preserve"> </w:t>
-      </w:r>
-    </w:p>
-    <w:p>
-      <w:pPr>
-        <w:pStyle w:val="Normal"/>
         <w:spacing w:lineRule="auto" w:line="252" w:before="0" w:after="5"/>
         <w:ind w:hanging="10" w:left="11"/>
-        <w:rPr/>
-      </w:pPr>
-      <w:r>
-        <w:rPr>
-          <w:sz w:val="21"/>
-        </w:rPr>
-        <w:t xml:space="preserve">An experienced and highly motivated </w:t>
-      </w:r>
-      <w:r>
-        <w:rPr>
-          <w:sz w:val="21"/>
-        </w:rPr>
-        <w:t>Software</w:t>
-      </w:r>
-      <w:r>
-        <w:rPr>
-          <w:sz w:val="21"/>
-        </w:rPr>
-        <w:t xml:space="preserve"> Engineer with a strong passion for learning and building </w:t>
-      </w:r>
-      <w:r>
-        <w:rPr>
-          <w:sz w:val="21"/>
-        </w:rPr>
-        <w:t>applications</w:t>
-      </w:r>
-      <w:r>
-        <w:rPr>
-          <w:sz w:val="21"/>
-        </w:rPr>
-        <w:t xml:space="preserve"> that provide a great user experience.</w:t>
+        <w:rPr>
+          <w:sz w:val="24"/>
+          <w:szCs w:val="24"/>
+        </w:rPr>
+      </w:pPr>
+      <w:r>
+        <w:rPr>
+          <w:sz w:val="24"/>
+          <w:szCs w:val="24"/>
+        </w:rPr>
+        <w:t>Software Engineer with commercial experience developing enterprise applications, automation solutions, API integrations and business-critical software systems. Skilled in TypeScript, Python, Laravel and React, with experience working across the full software development lifecycle including requirements analysis, development, testing and deployment. Passionate about solving complex technical problems and continuously expanding technical expertise.</w:t>
       </w:r>
     </w:p>
     <w:p>
@@ -266,8 +233,15 @@
         <w:rPr/>
       </w:pPr>
       <w:r>
-        <w:rPr/>
-        <w:t xml:space="preserve">Education </w:t>
+        <w:rPr>
+          <w:sz w:val="30"/>
+          <w:szCs w:val="30"/>
+        </w:rPr>
+        <w:t>Education</w:t>
+      </w:r>
+      <w:r>
+        <w:rPr/>
+        <w:t xml:space="preserve"> </w:t>
       </w:r>
     </w:p>
     <w:p>
@@ -308,9 +282,14 @@
                           </a:xfrm>
                           <a:custGeom>
                             <a:avLst/>
-                            <a:gdLst/>
+                            <a:gdLst>
+                              <a:gd name="textAreaLeft" fmla="*/ 0 w 3274560"/>
+                              <a:gd name="textAreaRight" fmla="*/ 3274920 w 3274560"/>
+                              <a:gd name="textAreaTop" fmla="*/ 0 h 10800"/>
+                              <a:gd name="textAreaBottom" fmla="*/ 11160 h 10800"/>
+                            </a:gdLst>
                             <a:ahLst/>
-                            <a:rect l="l" t="t" r="r" b="b"/>
+                            <a:rect l="textAreaLeft" t="textAreaTop" r="textAreaRight" b="textAreaBottom"/>
                             <a:pathLst>
                               <a:path w="5775960" h="19050">
                                 <a:moveTo>
@@ -363,54 +342,37 @@
     <w:p>
       <w:pPr>
         <w:pStyle w:val="Normal"/>
-        <w:spacing w:lineRule="auto" w:line="244" w:before="0" w:after="22"/>
+        <w:spacing w:lineRule="auto" w:line="242" w:before="0" w:after="22"/>
         <w:ind w:hanging="0" w:left="16"/>
         <w:rPr>
+          <w:sz w:val="24"/>
+          <w:szCs w:val="24"/>
+        </w:rPr>
+      </w:pPr>
+      <w:r>
+        <w:rPr>
           <w:b/>
-          <w:bCs/>
-          <w:sz w:val="22"/>
-        </w:rPr>
-      </w:pPr>
-      <w:r>
-        <w:rPr>
-          <w:b/>
-          <w:sz w:val="21"/>
+          <w:sz w:val="24"/>
+          <w:szCs w:val="24"/>
         </w:rPr>
         <w:t>Bachelor of Computer Science (Programming Languages Major)</w:t>
         <w:tab/>
-        <w:t xml:space="preserve">                        2023 - </w:t>
-      </w:r>
-      <w:r>
-        <w:rPr>
-          <w:b/>
-          <w:sz w:val="21"/>
-        </w:rPr>
-        <w:t>2026</w:t>
-      </w:r>
-      <w:r>
-        <w:rPr>
-          <w:b/>
-          <w:sz w:val="21"/>
-        </w:rPr>
-        <w:t xml:space="preserve"> </w:t>
-      </w:r>
-    </w:p>
-    <w:p>
-      <w:pPr>
-        <w:pStyle w:val="Normal"/>
-        <w:spacing w:lineRule="auto" w:line="244" w:before="0" w:after="22"/>
+        <w:t xml:space="preserve">        2026 </w:t>
+      </w:r>
+    </w:p>
+    <w:p>
+      <w:pPr>
+        <w:pStyle w:val="Normal"/>
+        <w:spacing w:lineRule="auto" w:line="242" w:before="0" w:after="22"/>
         <w:ind w:hanging="0" w:left="16"/>
         <w:rPr/>
       </w:pPr>
       <w:r>
         <w:rPr>
-          <w:sz w:val="22"/>
-        </w:rPr>
-        <w:t>University of Queensland</w:t>
-      </w:r>
-      <w:r>
-        <w:rPr/>
-        <w:t xml:space="preserve"> </w:t>
+          <w:sz w:val="24"/>
+          <w:szCs w:val="24"/>
+        </w:rPr>
+        <w:t xml:space="preserve">University of Queensland </w:t>
       </w:r>
       <w:r>
         <w:rPr>
@@ -438,7 +400,10 @@
         <w:rPr/>
       </w:pPr>
       <w:r>
-        <w:rPr/>
+        <w:rPr>
+          <w:sz w:val="30"/>
+          <w:szCs w:val="30"/>
+        </w:rPr>
         <w:t>Experience</w:t>
       </w:r>
       <w:r>
@@ -488,9 +453,14 @@
                           </a:xfrm>
                           <a:custGeom>
                             <a:avLst/>
-                            <a:gdLst/>
+                            <a:gdLst>
+                              <a:gd name="textAreaLeft" fmla="*/ 0 w 3274560"/>
+                              <a:gd name="textAreaRight" fmla="*/ 3274920 w 3274560"/>
+                              <a:gd name="textAreaTop" fmla="*/ 0 h 10800"/>
+                              <a:gd name="textAreaBottom" fmla="*/ 11160 h 10800"/>
+                            </a:gdLst>
                             <a:ahLst/>
-                            <a:rect l="l" t="t" r="r" b="b"/>
+                            <a:rect l="textAreaLeft" t="textAreaTop" r="textAreaRight" b="textAreaBottom"/>
                             <a:pathLst>
                               <a:path w="5775960" h="19050">
                                 <a:moveTo>
@@ -545,51 +515,31 @@
         <w:pStyle w:val="Normal"/>
         <w:spacing w:lineRule="auto" w:line="259" w:before="0" w:after="0"/>
         <w:ind w:hanging="10" w:left="-5"/>
-        <w:rPr/>
+        <w:rPr>
+          <w:sz w:val="24"/>
+          <w:szCs w:val="24"/>
+        </w:rPr>
       </w:pPr>
       <w:r>
         <w:rPr>
           <w:b/>
-          <w:sz w:val="21"/>
-        </w:rPr>
-        <w:t>Smoothx</w:t>
+          <w:sz w:val="24"/>
+          <w:szCs w:val="24"/>
+        </w:rPr>
+        <w:t xml:space="preserve">Smoothx                                                                                         </w:t>
+      </w:r>
+      <w:r>
+        <w:rPr>
+          <w:sz w:val="24"/>
+          <w:szCs w:val="24"/>
+        </w:rPr>
+        <w:t>Nov 2023 - Current</w:t>
       </w:r>
       <w:r>
         <w:rPr>
           <w:b/>
-          <w:sz w:val="21"/>
-        </w:rPr>
-        <w:t xml:space="preserve"> </w:t>
-      </w:r>
-      <w:r>
-        <w:rPr>
-          <w:b/>
-          <w:sz w:val="22"/>
-        </w:rPr>
-        <w:t xml:space="preserve">                                                                                                   </w:t>
-      </w:r>
-      <w:r>
-        <w:rPr>
-          <w:sz w:val="22"/>
-        </w:rPr>
-        <w:t xml:space="preserve"> </w:t>
-      </w:r>
-      <w:r>
-        <w:rPr>
-          <w:sz w:val="22"/>
-        </w:rPr>
-        <w:t>Nov 2023</w:t>
-      </w:r>
-      <w:r>
-        <w:rPr>
-          <w:sz w:val="22"/>
-        </w:rPr>
-        <w:t xml:space="preserve"> - Current</w:t>
-      </w:r>
-      <w:r>
-        <w:rPr>
-          <w:b/>
-          <w:sz w:val="21"/>
+          <w:sz w:val="24"/>
+          <w:szCs w:val="24"/>
         </w:rPr>
         <w:t xml:space="preserve"> </w:t>
       </w:r>
@@ -599,15 +549,17 @@
         <w:pStyle w:val="Normal"/>
         <w:spacing w:before="0" w:after="216"/>
         <w:ind w:hanging="10" w:left="26"/>
-        <w:rPr/>
-      </w:pPr>
-      <w:r>
-        <w:rPr/>
-        <w:t>FullStack</w:t>
-      </w:r>
-      <w:r>
-        <w:rPr/>
-        <w:t xml:space="preserve"> Software Engineer </w:t>
+        <w:rPr>
+          <w:sz w:val="24"/>
+          <w:szCs w:val="24"/>
+        </w:rPr>
+      </w:pPr>
+      <w:r>
+        <w:rPr>
+          <w:sz w:val="24"/>
+          <w:szCs w:val="24"/>
+        </w:rPr>
+        <w:t xml:space="preserve">Full Stack Software Engineer </w:t>
       </w:r>
     </w:p>
     <w:p>
@@ -619,39 +571,37 @@
         </w:numPr>
         <w:ind w:hanging="360" w:left="706"/>
         <w:rPr>
+          <w:sz w:val="24"/>
+          <w:szCs w:val="24"/>
+        </w:rPr>
+      </w:pPr>
+      <w:r>
+        <w:rPr>
           <w:b w:val="false"/>
           <w:bCs w:val="false"/>
-          <w:sz w:val="20"/>
-          <w:szCs w:val="20"/>
-        </w:rPr>
-      </w:pPr>
-      <w:r>
+          <w:sz w:val="24"/>
+          <w:szCs w:val="24"/>
+        </w:rPr>
+        <w:t>Developed and maintained enterprise software platforms supporting business operations, financial workflows and system integrations.</w:t>
+      </w:r>
+    </w:p>
+    <w:p>
+      <w:pPr>
+        <w:pStyle w:val="Normal"/>
+        <w:ind w:hanging="0" w:left="706"/>
         <w:rPr>
           <w:b w:val="false"/>
           <w:bCs w:val="false"/>
-          <w:sz w:val="20"/>
-          <w:szCs w:val="20"/>
-        </w:rPr>
-        <w:t>Developed and maintained enterprise software platforms supporting business operations, financial workflows and system integrations.</w:t>
-      </w:r>
-    </w:p>
-    <w:p>
-      <w:pPr>
-        <w:pStyle w:val="Normal"/>
-        <w:ind w:hanging="0" w:left="706"/>
+          <w:sz w:val="24"/>
+          <w:szCs w:val="24"/>
+        </w:rPr>
+      </w:pPr>
+      <w:r>
         <w:rPr>
           <w:b w:val="false"/>
           <w:bCs w:val="false"/>
-          <w:sz w:val="20"/>
-          <w:szCs w:val="20"/>
-        </w:rPr>
-      </w:pPr>
-      <w:r>
-        <w:rPr>
-          <w:b w:val="false"/>
-          <w:bCs w:val="false"/>
-          <w:sz w:val="20"/>
-          <w:szCs w:val="20"/>
+          <w:sz w:val="24"/>
+          <w:szCs w:val="24"/>
         </w:rPr>
       </w:r>
     </w:p>
@@ -664,20 +614,18 @@
         </w:numPr>
         <w:ind w:hanging="360" w:left="706"/>
         <w:rPr>
+          <w:sz w:val="24"/>
+          <w:szCs w:val="24"/>
+        </w:rPr>
+      </w:pPr>
+      <w:r>
+        <w:rPr>
           <w:b w:val="false"/>
           <w:bCs w:val="false"/>
-          <w:sz w:val="20"/>
-          <w:szCs w:val="20"/>
-        </w:rPr>
-      </w:pPr>
-      <w:r>
-        <w:rPr>
-          <w:b w:val="false"/>
-          <w:bCs w:val="false"/>
-          <w:sz w:val="20"/>
-          <w:szCs w:val="20"/>
-        </w:rPr>
-        <w:t>Designed and implemented JavaScript-based automation solutions and webhook integrations, reducing manual processing and improving operational efficiency.</w:t>
+          <w:sz w:val="24"/>
+          <w:szCs w:val="24"/>
+        </w:rPr>
+        <w:t>Designed and implemented JavaScript-based automation solutions and webhook/API integrations that streamlined business workflows, reduced manual processing and improved data consistency across multiple systems.</w:t>
       </w:r>
     </w:p>
     <w:p>
@@ -691,16 +639,16 @@
         <w:rPr>
           <w:b w:val="false"/>
           <w:bCs w:val="false"/>
-          <w:sz w:val="20"/>
-          <w:szCs w:val="20"/>
+          <w:sz w:val="24"/>
+          <w:szCs w:val="24"/>
         </w:rPr>
       </w:pPr>
       <w:r>
         <w:rPr>
           <w:b w:val="false"/>
           <w:bCs w:val="false"/>
-          <w:sz w:val="20"/>
-          <w:szCs w:val="20"/>
+          <w:sz w:val="24"/>
+          <w:szCs w:val="24"/>
         </w:rPr>
       </w:r>
     </w:p>
@@ -713,20 +661,18 @@
         </w:numPr>
         <w:ind w:hanging="360" w:left="706"/>
         <w:rPr>
+          <w:sz w:val="24"/>
+          <w:szCs w:val="24"/>
+        </w:rPr>
+      </w:pPr>
+      <w:r>
+        <w:rPr>
           <w:b w:val="false"/>
           <w:bCs w:val="false"/>
-          <w:sz w:val="20"/>
-          <w:szCs w:val="20"/>
-        </w:rPr>
-      </w:pPr>
-      <w:r>
-        <w:rPr>
-          <w:b w:val="false"/>
-          <w:bCs w:val="false"/>
-          <w:sz w:val="20"/>
-          <w:szCs w:val="20"/>
-        </w:rPr>
-        <w:t>Built API integrations and event-driven workflows to synchronise data between multiple business systems in real time.</w:t>
+          <w:sz w:val="24"/>
+          <w:szCs w:val="24"/>
+        </w:rPr>
+        <w:t>Mentored and onboarded a junior developer, providing guidance on development workflows, ticket management processes, coding standards and development setup to support their successful integration into the team.</w:t>
       </w:r>
     </w:p>
     <w:p>
@@ -740,16 +686,16 @@
         <w:rPr>
           <w:b w:val="false"/>
           <w:bCs w:val="false"/>
-          <w:sz w:val="20"/>
-          <w:szCs w:val="20"/>
+          <w:sz w:val="24"/>
+          <w:szCs w:val="24"/>
         </w:rPr>
       </w:pPr>
       <w:r>
         <w:rPr>
           <w:b w:val="false"/>
           <w:bCs w:val="false"/>
-          <w:sz w:val="20"/>
-          <w:szCs w:val="20"/>
+          <w:sz w:val="24"/>
+          <w:szCs w:val="24"/>
         </w:rPr>
       </w:r>
     </w:p>
@@ -762,18 +708,16 @@
         </w:numPr>
         <w:ind w:hanging="360" w:left="706"/>
         <w:rPr>
+          <w:sz w:val="24"/>
+          <w:szCs w:val="24"/>
+        </w:rPr>
+      </w:pPr>
+      <w:r>
+        <w:rPr>
           <w:b w:val="false"/>
           <w:bCs w:val="false"/>
-          <w:sz w:val="20"/>
-          <w:szCs w:val="20"/>
-        </w:rPr>
-      </w:pPr>
-      <w:r>
-        <w:rPr>
-          <w:b w:val="false"/>
-          <w:bCs w:val="false"/>
-          <w:sz w:val="20"/>
-          <w:szCs w:val="20"/>
+          <w:sz w:val="24"/>
+          <w:szCs w:val="24"/>
         </w:rPr>
         <w:t>Worked within large-scale codebases exceeding 100,000 lines of code, participating in feature development, code reviews, testing and deployment activities.</w:t>
       </w:r>
@@ -789,16 +733,16 @@
         <w:rPr>
           <w:b w:val="false"/>
           <w:bCs w:val="false"/>
-          <w:sz w:val="20"/>
-          <w:szCs w:val="20"/>
+          <w:sz w:val="24"/>
+          <w:szCs w:val="24"/>
         </w:rPr>
       </w:pPr>
       <w:r>
         <w:rPr>
           <w:b w:val="false"/>
           <w:bCs w:val="false"/>
-          <w:sz w:val="20"/>
-          <w:szCs w:val="20"/>
+          <w:sz w:val="24"/>
+          <w:szCs w:val="24"/>
         </w:rPr>
       </w:r>
     </w:p>
@@ -811,18 +755,16 @@
         </w:numPr>
         <w:ind w:hanging="360" w:left="706"/>
         <w:rPr>
+          <w:sz w:val="24"/>
+          <w:szCs w:val="24"/>
+        </w:rPr>
+      </w:pPr>
+      <w:r>
+        <w:rPr>
           <w:b w:val="false"/>
           <w:bCs w:val="false"/>
-          <w:sz w:val="20"/>
-          <w:szCs w:val="20"/>
-        </w:rPr>
-      </w:pPr>
-      <w:r>
-        <w:rPr>
-          <w:b w:val="false"/>
-          <w:bCs w:val="false"/>
-          <w:sz w:val="20"/>
-          <w:szCs w:val="20"/>
+          <w:sz w:val="24"/>
+          <w:szCs w:val="24"/>
         </w:rPr>
         <w:t>Collaborated with stakeholders to analyse business requirements and deliver scalable software solutions aligned with operational objectives.</w:t>
       </w:r>
@@ -838,16 +780,16 @@
         <w:rPr>
           <w:b w:val="false"/>
           <w:bCs w:val="false"/>
-          <w:sz w:val="20"/>
-          <w:szCs w:val="20"/>
+          <w:sz w:val="24"/>
+          <w:szCs w:val="24"/>
         </w:rPr>
       </w:pPr>
       <w:r>
         <w:rPr>
           <w:b w:val="false"/>
           <w:bCs w:val="false"/>
-          <w:sz w:val="20"/>
-          <w:szCs w:val="20"/>
+          <w:sz w:val="24"/>
+          <w:szCs w:val="24"/>
         </w:rPr>
       </w:r>
     </w:p>
@@ -860,20 +802,18 @@
         </w:numPr>
         <w:ind w:hanging="360" w:left="706"/>
         <w:rPr>
+          <w:sz w:val="24"/>
+          <w:szCs w:val="24"/>
+        </w:rPr>
+      </w:pPr>
+      <w:r>
+        <w:rPr>
           <w:b w:val="false"/>
           <w:bCs w:val="false"/>
-          <w:sz w:val="20"/>
-          <w:szCs w:val="20"/>
-        </w:rPr>
-      </w:pPr>
-      <w:r>
-        <w:rPr>
-          <w:b w:val="false"/>
-          <w:bCs w:val="false"/>
-          <w:sz w:val="20"/>
-          <w:szCs w:val="20"/>
-        </w:rPr>
-        <w:t>Diagnosed and resolved complex application and integration issues across frontend and backend systems.</w:t>
+          <w:sz w:val="24"/>
+          <w:szCs w:val="24"/>
+        </w:rPr>
+        <w:t>Diagnosed and resolved complex application and integration issues across frontend and backend systems, improving system reliability and reducing disruption to users.</w:t>
       </w:r>
     </w:p>
     <w:p>
@@ -891,9 +831,29 @@
       </w:pPr>
       <w:r>
         <w:rPr>
+          <w:sz w:val="24"/>
+          <w:szCs w:val="24"/>
+        </w:rPr>
+      </w:r>
+    </w:p>
+    <w:p>
+      <w:pPr>
+        <w:pStyle w:val="Normal"/>
+        <w:numPr>
+          <w:ilvl w:val="0"/>
+          <w:numId w:val="0"/>
+        </w:numPr>
+        <w:ind w:hanging="0" w:left="706"/>
+        <w:rPr>
           <w:b w:val="false"/>
           <w:bCs w:val="false"/>
         </w:rPr>
+      </w:pPr>
+      <w:r>
+        <w:rPr>
+          <w:b w:val="false"/>
+          <w:bCs w:val="false"/>
+        </w:rPr>
       </w:r>
     </w:p>
     <w:p>
@@ -901,38 +861,31 @@
         <w:pStyle w:val="Normal"/>
         <w:spacing w:lineRule="auto" w:line="259" w:before="0" w:after="0"/>
         <w:ind w:hanging="10" w:left="-5"/>
-        <w:rPr/>
+        <w:rPr>
+          <w:sz w:val="24"/>
+          <w:szCs w:val="24"/>
+        </w:rPr>
       </w:pPr>
       <w:r>
         <w:rPr>
           <w:b/>
-          <w:sz w:val="21"/>
-        </w:rPr>
-        <w:t xml:space="preserve">Self Employed </w:t>
+          <w:sz w:val="24"/>
+          <w:szCs w:val="24"/>
+        </w:rPr>
+        <w:t xml:space="preserve">Self Employed                                                                            </w:t>
+      </w:r>
+      <w:r>
+        <w:rPr>
+          <w:sz w:val="24"/>
+          <w:szCs w:val="24"/>
+        </w:rPr>
+        <w:t>Jun 2022 – Dec 2022</w:t>
       </w:r>
       <w:r>
         <w:rPr>
           <w:b/>
-          <w:sz w:val="22"/>
-        </w:rPr>
-        <w:t xml:space="preserve">                                                                                         </w:t>
-      </w:r>
-      <w:r>
-        <w:rPr>
-          <w:sz w:val="22"/>
-        </w:rPr>
-        <w:t xml:space="preserve">Jun 2022 – </w:t>
-      </w:r>
-      <w:r>
-        <w:rPr>
-          <w:sz w:val="22"/>
-        </w:rPr>
-        <w:t>Dec 2022</w:t>
-      </w:r>
-      <w:r>
-        <w:rPr>
-          <w:b/>
-          <w:sz w:val="21"/>
+          <w:sz w:val="24"/>
+          <w:szCs w:val="24"/>
         </w:rPr>
         <w:t xml:space="preserve"> </w:t>
       </w:r>
@@ -942,10 +895,16 @@
         <w:pStyle w:val="Normal"/>
         <w:spacing w:before="0" w:after="216"/>
         <w:ind w:hanging="10" w:left="26"/>
-        <w:rPr/>
-      </w:pPr>
-      <w:r>
-        <w:rPr/>
+        <w:rPr>
+          <w:sz w:val="24"/>
+          <w:szCs w:val="24"/>
+        </w:rPr>
+      </w:pPr>
+      <w:r>
+        <w:rPr>
+          <w:sz w:val="24"/>
+          <w:szCs w:val="24"/>
+        </w:rPr>
         <w:t xml:space="preserve">Programming Tutor </w:t>
       </w:r>
     </w:p>
@@ -958,14 +917,14 @@
         </w:numPr>
         <w:ind w:hanging="360" w:left="706"/>
         <w:rPr>
-          <w:sz w:val="20"/>
-          <w:szCs w:val="20"/>
-        </w:rPr>
-      </w:pPr>
-      <w:r>
-        <w:rPr>
-          <w:sz w:val="20"/>
-          <w:szCs w:val="20"/>
+          <w:sz w:val="24"/>
+          <w:szCs w:val="24"/>
+        </w:rPr>
+      </w:pPr>
+      <w:r>
+        <w:rPr>
+          <w:sz w:val="24"/>
+          <w:szCs w:val="24"/>
         </w:rPr>
         <w:t>Tutored clients HTML, CSS, Flexbox and JavaScript best practises</w:t>
       </w:r>
@@ -979,14 +938,14 @@
         </w:numPr>
         <w:ind w:hanging="0" w:left="706"/>
         <w:rPr>
-          <w:sz w:val="20"/>
-          <w:szCs w:val="20"/>
-        </w:rPr>
-      </w:pPr>
-      <w:r>
-        <w:rPr>
-          <w:sz w:val="20"/>
-          <w:szCs w:val="20"/>
+          <w:sz w:val="24"/>
+          <w:szCs w:val="24"/>
+        </w:rPr>
+      </w:pPr>
+      <w:r>
+        <w:rPr>
+          <w:sz w:val="24"/>
+          <w:szCs w:val="24"/>
         </w:rPr>
       </w:r>
     </w:p>
@@ -1000,14 +959,14 @@
         <w:spacing w:before="0" w:after="27"/>
         <w:ind w:hanging="360" w:left="706"/>
         <w:rPr>
-          <w:sz w:val="20"/>
-          <w:szCs w:val="20"/>
-        </w:rPr>
-      </w:pPr>
-      <w:r>
-        <w:rPr>
-          <w:sz w:val="20"/>
-          <w:szCs w:val="20"/>
+          <w:sz w:val="24"/>
+          <w:szCs w:val="24"/>
+        </w:rPr>
+      </w:pPr>
+      <w:r>
+        <w:rPr>
+          <w:sz w:val="24"/>
+          <w:szCs w:val="24"/>
         </w:rPr>
         <w:t xml:space="preserve">Simplified difficult programming concepts including responsive website development, CSS layout, Promises and API requests </w:t>
       </w:r>
@@ -1022,14 +981,14 @@
         <w:spacing w:before="0" w:after="27"/>
         <w:ind w:hanging="0" w:left="706"/>
         <w:rPr>
-          <w:sz w:val="20"/>
-          <w:szCs w:val="20"/>
-        </w:rPr>
-      </w:pPr>
-      <w:r>
-        <w:rPr>
-          <w:sz w:val="20"/>
-          <w:szCs w:val="20"/>
+          <w:sz w:val="24"/>
+          <w:szCs w:val="24"/>
+        </w:rPr>
+      </w:pPr>
+      <w:r>
+        <w:rPr>
+          <w:sz w:val="24"/>
+          <w:szCs w:val="24"/>
         </w:rPr>
       </w:r>
     </w:p>
@@ -1042,14 +1001,14 @@
         </w:numPr>
         <w:ind w:hanging="360" w:left="706"/>
         <w:rPr>
-          <w:sz w:val="20"/>
-          <w:szCs w:val="20"/>
-        </w:rPr>
-      </w:pPr>
-      <w:r>
-        <w:rPr>
-          <w:sz w:val="20"/>
-          <w:szCs w:val="20"/>
+          <w:sz w:val="24"/>
+          <w:szCs w:val="24"/>
+        </w:rPr>
+      </w:pPr>
+      <w:r>
+        <w:rPr>
+          <w:sz w:val="24"/>
+          <w:szCs w:val="24"/>
         </w:rPr>
         <w:t xml:space="preserve">Taught debugging best practises using Google Chrome inspect element tooling </w:t>
       </w:r>
@@ -1063,14 +1022,14 @@
         </w:numPr>
         <w:ind w:hanging="0" w:left="706"/>
         <w:rPr>
-          <w:sz w:val="20"/>
-          <w:szCs w:val="20"/>
-        </w:rPr>
-      </w:pPr>
-      <w:r>
-        <w:rPr>
-          <w:sz w:val="20"/>
-          <w:szCs w:val="20"/>
+          <w:sz w:val="24"/>
+          <w:szCs w:val="24"/>
+        </w:rPr>
+      </w:pPr>
+      <w:r>
+        <w:rPr>
+          <w:sz w:val="24"/>
+          <w:szCs w:val="24"/>
         </w:rPr>
       </w:r>
     </w:p>
@@ -1083,18 +1042,16 @@
         </w:numPr>
         <w:ind w:hanging="360" w:left="706"/>
         <w:rPr>
+          <w:sz w:val="24"/>
+          <w:szCs w:val="24"/>
+        </w:rPr>
+      </w:pPr>
+      <w:r>
+        <w:rPr>
           <w:b w:val="false"/>
           <w:bCs w:val="false"/>
-          <w:sz w:val="20"/>
-          <w:szCs w:val="20"/>
-        </w:rPr>
-      </w:pPr>
-      <w:r>
-        <w:rPr>
-          <w:b w:val="false"/>
-          <w:bCs w:val="false"/>
-          <w:sz w:val="20"/>
-          <w:szCs w:val="20"/>
+          <w:sz w:val="24"/>
+          <w:szCs w:val="24"/>
         </w:rPr>
         <w:t>Provided website UI designs to 1:1 and reviewed code through weekly code reviews</w:t>
       </w:r>
@@ -1119,10 +1076,16 @@
       <w:pPr>
         <w:pStyle w:val="Heading1"/>
         <w:ind w:hanging="10" w:left="-5"/>
-        <w:rPr/>
-      </w:pPr>
-      <w:r>
-        <w:rPr/>
+        <w:rPr>
+          <w:sz w:val="30"/>
+          <w:szCs w:val="30"/>
+        </w:rPr>
+      </w:pPr>
+      <w:r>
+        <w:rPr>
+          <w:sz w:val="30"/>
+          <w:szCs w:val="30"/>
+        </w:rPr>
         <w:t>Awards and Achievements</w:t>
       </w:r>
     </w:p>
@@ -1164,9 +1127,14 @@
                           </a:xfrm>
                           <a:custGeom>
                             <a:avLst/>
-                            <a:gdLst/>
+                            <a:gdLst>
+                              <a:gd name="textAreaLeft" fmla="*/ 0 w 3274560"/>
+                              <a:gd name="textAreaRight" fmla="*/ 3274920 w 3274560"/>
+                              <a:gd name="textAreaTop" fmla="*/ 0 h 10800"/>
+                              <a:gd name="textAreaBottom" fmla="*/ 11160 h 10800"/>
+                            </a:gdLst>
                             <a:ahLst/>
-                            <a:rect l="l" t="t" r="r" b="b"/>
+                            <a:rect l="textAreaLeft" t="textAreaTop" r="textAreaRight" b="textAreaBottom"/>
                             <a:pathLst>
                               <a:path w="5775960" h="19050">
                                 <a:moveTo>
@@ -1219,39 +1187,19 @@
     <w:p>
       <w:pPr>
         <w:pStyle w:val="Normal"/>
-        <w:spacing w:lineRule="auto" w:line="259" w:before="0" w:after="103"/>
-        <w:ind w:hanging="0" w:left="16"/>
-        <w:rPr/>
-      </w:pPr>
-      <w:r>
-        <w:rPr>
-          <w:sz w:val="11"/>
-        </w:rPr>
-        <w:t xml:space="preserve"> </w:t>
-      </w:r>
-    </w:p>
-    <w:p>
-      <w:pPr>
-        <w:pStyle w:val="Normal"/>
         <w:spacing w:lineRule="auto" w:line="259" w:before="0" w:after="42"/>
         <w:ind w:hanging="16" w:left="16" w:right="3098"/>
-        <w:rPr/>
-      </w:pPr>
-      <w:r>
-        <w:rPr/>
-        <w:t>A</w:t>
-      </w:r>
-      <w:r>
-        <w:rPr/>
-        <w:t>ustralian Defence Force</w:t>
-      </w:r>
-      <w:r>
-        <w:rPr/>
-        <w:t xml:space="preserve"> Future Innovators Award </w:t>
-      </w:r>
-      <w:r>
-        <w:rPr/>
-        <w:t>2020/2022</w:t>
+        <w:rPr>
+          <w:sz w:val="24"/>
+          <w:szCs w:val="24"/>
+        </w:rPr>
+      </w:pPr>
+      <w:r>
+        <w:rPr>
+          <w:sz w:val="24"/>
+          <w:szCs w:val="24"/>
+        </w:rPr>
+        <w:t>Australian Defence Force Future Innovators Award 2020/2022</w:t>
       </w:r>
     </w:p>
     <w:p>
@@ -1263,10 +1211,16 @@
         </w:numPr>
         <w:spacing w:before="0" w:after="27"/>
         <w:ind w:hanging="0" w:left="706"/>
-        <w:rPr/>
-      </w:pPr>
-      <w:r>
-        <w:rPr/>
+        <w:rPr>
+          <w:sz w:val="24"/>
+          <w:szCs w:val="24"/>
+        </w:rPr>
+      </w:pPr>
+      <w:r>
+        <w:rPr>
+          <w:sz w:val="24"/>
+          <w:szCs w:val="24"/>
+        </w:rPr>
       </w:r>
     </w:p>
     <w:p>
@@ -1277,10 +1231,16 @@
           <w:numId w:val="2"/>
         </w:numPr>
         <w:ind w:hanging="360" w:left="706"/>
-        <w:rPr/>
-      </w:pPr>
-      <w:r>
-        <w:rPr/>
+        <w:rPr>
+          <w:sz w:val="24"/>
+          <w:szCs w:val="24"/>
+        </w:rPr>
+      </w:pPr>
+      <w:r>
+        <w:rPr>
+          <w:sz w:val="24"/>
+          <w:szCs w:val="24"/>
+        </w:rPr>
         <w:t>Awarded for demonstrating outstanding innovation, academic achievement, and creative problem-solving capabilities in science and technology.</w:t>
       </w:r>
     </w:p>
@@ -1318,8 +1278,15 @@
         <w:rPr/>
       </w:pPr>
       <w:r>
-        <w:rPr/>
-        <w:t xml:space="preserve">Technical Skills  </w:t>
+        <w:rPr>
+          <w:sz w:val="30"/>
+          <w:szCs w:val="30"/>
+        </w:rPr>
+        <w:t>Technical Skills</w:t>
+      </w:r>
+      <w:r>
+        <w:rPr/>
+        <w:t xml:space="preserve">  </w:t>
       </w:r>
     </w:p>
     <w:p>
@@ -1360,9 +1327,14 @@
                           </a:xfrm>
                           <a:custGeom>
                             <a:avLst/>
-                            <a:gdLst/>
+                            <a:gdLst>
+                              <a:gd name="textAreaLeft" fmla="*/ 0 w 3274560"/>
+                              <a:gd name="textAreaRight" fmla="*/ 3274920 w 3274560"/>
+                              <a:gd name="textAreaTop" fmla="*/ 0 h 10800"/>
+                              <a:gd name="textAreaBottom" fmla="*/ 11160 h 10800"/>
+                            </a:gdLst>
                             <a:ahLst/>
-                            <a:rect l="l" t="t" r="r" b="b"/>
+                            <a:rect l="textAreaLeft" t="textAreaTop" r="textAreaRight" b="textAreaBottom"/>
                             <a:pathLst>
                               <a:path w="5775960" h="19050">
                                 <a:moveTo>
@@ -1426,64 +1398,68 @@
         </w:rPr>
         <w:t xml:space="preserve"> </w:t>
       </w:r>
-    </w:p>
-    <w:p>
-      <w:pPr>
-        <w:pStyle w:val="Normal"/>
-        <w:spacing w:lineRule="auto" w:line="259" w:before="0" w:after="413"/>
-        <w:ind w:hanging="0" w:left="16"/>
-        <w:rPr/>
-      </w:pPr>
       <w:r>
         <w:rPr>
           <w:b/>
+          <w:sz w:val="24"/>
+          <w:szCs w:val="24"/>
         </w:rPr>
         <w:t xml:space="preserve">Proficient: </w:t>
       </w:r>
       <w:r>
-        <w:rPr/>
-        <w:t xml:space="preserve">Html5, CSS3 (BEM), </w:t>
-      </w:r>
-      <w:r>
-        <w:rPr/>
-        <w:t>Typescript</w:t>
-      </w:r>
-      <w:r>
-        <w:rPr/>
-        <w:t xml:space="preserve">, React (+hooks), npm, NextJS, Git, GitHub, Python, </w:t>
-      </w:r>
-      <w:r>
-        <w:rPr/>
-        <w:t xml:space="preserve">Laravel, </w:t>
+        <w:rPr>
+          <w:b w:val="false"/>
+          <w:bCs w:val="false"/>
+          <w:sz w:val="24"/>
+          <w:szCs w:val="24"/>
+        </w:rPr>
+        <w:t xml:space="preserve">Python, Laravel, </w:t>
+      </w:r>
+      <w:r>
+        <w:rPr>
+          <w:sz w:val="24"/>
+          <w:szCs w:val="24"/>
+        </w:rPr>
+        <w:t>Html5, CSS3 (BEM), Typescript, React (+hooks), npm, NextJS, Git, GitHub</w:t>
       </w:r>
     </w:p>
     <w:p>
       <w:pPr>
         <w:pStyle w:val="Normal"/>
         <w:ind w:hanging="10" w:left="26"/>
-        <w:rPr/>
+        <w:rPr>
+          <w:sz w:val="24"/>
+          <w:szCs w:val="24"/>
+        </w:rPr>
       </w:pPr>
       <w:r>
         <w:rPr>
           <w:b/>
+          <w:sz w:val="24"/>
+          <w:szCs w:val="24"/>
         </w:rPr>
         <w:t xml:space="preserve">Familiar: </w:t>
       </w:r>
       <w:r>
-        <w:rPr/>
-        <w:t>Java</w:t>
-      </w:r>
-      <w:r>
-        <w:rPr/>
-        <w:t xml:space="preserve">, </w:t>
-      </w:r>
-      <w:r>
-        <w:rPr/>
-        <w:t>Linux</w:t>
-      </w:r>
-      <w:r>
-        <w:rPr/>
-        <w:t>, React dev tools, Firebase, C</w:t>
+        <w:rPr>
+          <w:sz w:val="24"/>
+          <w:szCs w:val="24"/>
+        </w:rPr>
+        <w:t xml:space="preserve">Java, Linux, </w:t>
+      </w:r>
+      <w:r>
+        <w:rPr>
+          <w:sz w:val="24"/>
+          <w:szCs w:val="24"/>
+        </w:rPr>
+        <w:t>Docker</w:t>
+      </w:r>
+      <w:r>
+        <w:rPr>
+          <w:sz w:val="24"/>
+          <w:szCs w:val="24"/>
+        </w:rPr>
+        <w:t>, Firebase, C</w:t>
       </w:r>
     </w:p>
     <w:p>
@@ -1503,8 +1479,15 @@
         <w:rPr/>
       </w:pPr>
       <w:r>
-        <w:rPr/>
-        <w:t xml:space="preserve">Referees  </w:t>
+        <w:rPr>
+          <w:sz w:val="30"/>
+          <w:szCs w:val="30"/>
+        </w:rPr>
+        <w:t>Referees</w:t>
+      </w:r>
+      <w:r>
+        <w:rPr/>
+        <w:t xml:space="preserve">  </w:t>
       </w:r>
     </w:p>
     <w:p>
@@ -1545,9 +1528,14 @@
                           </a:xfrm>
                           <a:custGeom>
                             <a:avLst/>
-                            <a:gdLst/>
+                            <a:gdLst>
+                              <a:gd name="textAreaLeft" fmla="*/ 0 w 3274560"/>
+                              <a:gd name="textAreaRight" fmla="*/ 3274920 w 3274560"/>
+                              <a:gd name="textAreaTop" fmla="*/ 0 h 10800"/>
+                              <a:gd name="textAreaBottom" fmla="*/ 11160 h 10800"/>
+                            </a:gdLst>
                             <a:ahLst/>
-                            <a:rect l="l" t="t" r="r" b="b"/>
+                            <a:rect l="textAreaLeft" t="textAreaTop" r="textAreaRight" b="textAreaBottom"/>
                             <a:pathLst>
                               <a:path w="5775960" h="19050">
                                 <a:moveTo>
@@ -1600,25 +1588,14 @@
     <w:p>
       <w:pPr>
         <w:pStyle w:val="Normal"/>
-        <w:spacing w:lineRule="auto" w:line="259" w:before="0" w:after="0"/>
-        <w:ind w:hanging="0" w:left="16"/>
-        <w:rPr/>
-      </w:pPr>
-      <w:r>
-        <w:rPr/>
-        <w:t xml:space="preserve"> </w:t>
-      </w:r>
-    </w:p>
-    <w:p>
-      <w:pPr>
-        <w:pStyle w:val="Normal"/>
         <w:spacing w:lineRule="auto" w:line="252" w:before="0" w:after="5"/>
         <w:ind w:hanging="10" w:left="11"/>
         <w:rPr/>
       </w:pPr>
       <w:r>
         <w:rPr>
-          <w:sz w:val="21"/>
+          <w:sz w:val="24"/>
+          <w:szCs w:val="24"/>
         </w:rPr>
         <w:t>Available upon request.</w:t>
       </w:r>
@@ -2663,8 +2640,9 @@
     <w:qFormat/>
     <w:pPr>
       <w:widowControl/>
+      <w:suppressAutoHyphens w:val="true"/>
       <w:bidi w:val="0"/>
-      <w:spacing w:lineRule="auto" w:line="261" w:before="0" w:after="3"/>
+      <w:spacing w:lineRule="auto" w:line="259" w:before="0" w:after="3"/>
       <w:ind w:hanging="10" w:left="28"/>
       <w:jc w:val="left"/>
     </w:pPr>
@@ -2687,6 +2665,7 @@
       <w:keepNext w:val="true"/>
       <w:keepLines/>
       <w:widowControl/>
+      <w:suppressAutoHyphens w:val="true"/>
       <w:bidi w:val="0"/>
       <w:spacing w:lineRule="auto" w:line="259" w:before="0" w:after="0"/>
       <w:ind w:hanging="10" w:left="10"/>

</xml_diff>